<commit_message>
docs: expand Google Sheets sync section with full step-by-step guide
Explains the complete workflow: export CSV → import to Sheets → edit
prices/stock → share as public → sync back to CRM. Includes column
reference table showing what is and isn't editable via the sheet.

https://claude.ai/code/session_019Q8F129a3a5SxkGUYU9d9a
</commit_message>
<xml_diff>
--- a/GUIA_KAIROS_CRM.docx
+++ b/GUIA_KAIROS_CRM.docx
@@ -5610,7 +5610,129 @@
           <w:color w:val="4A3728"/>
           <w:sz w:val="22"/>
         </w:rPr>
-        <w:t>Opciones de importación y sincronización</w:t>
+        <w:t>Importar Kairosdis</w:t>
+      </w:r>
+    </w:p>
+    <w:p>
+      <w:pPr>
+        <w:spacing w:before="40" w:after="40" w:line="276" w:lineRule="auto"/>
+      </w:pPr>
+      <w:r>
+        <w:rPr>
+          <w:sz w:val="20"/>
+        </w:rPr>
+        <w:t>El botón "Importar Kairosdis" scrapea kairosdis.com.ar y sincroniza todos los productos (nombre, precio, imágenes). Muestra porcentaje de avance en tiempo real. Al terminar informa cuántos productos son nuevos y cuántos fueron actualizados.</w:t>
+      </w:r>
+    </w:p>
+    <w:p>
+      <w:pPr>
+        <w:spacing w:before="200" w:after="60"/>
+        <w:pBdr>
+          <w:bottom w:val="single" w:sz="4" w:space="1" w:color="C9A040"/>
+        </w:pBdr>
+      </w:pPr>
+      <w:r>
+        <w:rPr>
+          <w:b/>
+          <w:color w:val="4A3728"/>
+          <w:sz w:val="22"/>
+        </w:rPr>
+        <w:t>Sincronizar precios desde Google Sheets — paso a paso</w:t>
+      </w:r>
+    </w:p>
+    <w:p>
+      <w:pPr>
+        <w:spacing w:before="40" w:after="40" w:line="276" w:lineRule="auto"/>
+      </w:pPr>
+      <w:r>
+        <w:rPr>
+          <w:sz w:val="20"/>
+        </w:rPr>
+        <w:t>El botón "Sync desde Sheet" lee la planilla del catálogo en Google Sheets y aplica los cambios de precios, stock y estado al sistema en segundos. Es la forma más rápida de actualizar precios en masa.</w:t>
+      </w:r>
+    </w:p>
+    <w:p>
+      <w:pPr>
+        <w:pStyle w:val="ListNumber"/>
+        <w:spacing w:before="20" w:after="20"/>
+      </w:pPr>
+      <w:r>
+        <w:rPr>
+          <w:sz w:val="20"/>
+        </w:rPr>
+        <w:t>En el Catálogo, hacé click en "Exportar CSV" — descarga todos los productos con sus datos actuales.</w:t>
+      </w:r>
+    </w:p>
+    <w:p>
+      <w:pPr>
+        <w:pStyle w:val="ListNumber"/>
+        <w:spacing w:before="20" w:after="20"/>
+      </w:pPr>
+      <w:r>
+        <w:rPr>
+          <w:sz w:val="20"/>
+        </w:rPr>
+        <w:t>Abrí el CSV en Excel o Google Sheets. En Google Sheets: Archivo → Importar → Subir el CSV.</w:t>
+      </w:r>
+    </w:p>
+    <w:p>
+      <w:pPr>
+        <w:pStyle w:val="ListNumber"/>
+        <w:spacing w:before="20" w:after="20"/>
+      </w:pPr>
+      <w:r>
+        <w:rPr>
+          <w:sz w:val="20"/>
+        </w:rPr>
+        <w:t>Editá los valores que necesitás: precios, stock, activo. No modifiques la columna ID — es la clave que el sistema usa para identificar cada producto.</w:t>
+      </w:r>
+    </w:p>
+    <w:p>
+      <w:pPr>
+        <w:pStyle w:val="ListNumber"/>
+        <w:spacing w:before="20" w:after="20"/>
+      </w:pPr>
+      <w:r>
+        <w:rPr>
+          <w:sz w:val="20"/>
+        </w:rPr>
+        <w:t>Compartí la planilla como pública de solo lectura: "Compartir" → "Cualquiera con el link puede ver" → rol Lector.</w:t>
+      </w:r>
+    </w:p>
+    <w:p>
+      <w:pPr>
+        <w:pStyle w:val="ListNumber"/>
+        <w:spacing w:before="20" w:after="20"/>
+      </w:pPr>
+      <w:r>
+        <w:rPr>
+          <w:sz w:val="20"/>
+        </w:rPr>
+        <w:t>Volvé al CRM, sección Catálogo, hacé click en "Sync desde Sheet".</w:t>
+      </w:r>
+    </w:p>
+    <w:p>
+      <w:pPr>
+        <w:pStyle w:val="ListNumber"/>
+        <w:spacing w:before="20" w:after="20"/>
+      </w:pPr>
+      <w:r>
+        <w:rPr>
+          <w:sz w:val="20"/>
+        </w:rPr>
+        <w:t>El sistema actualiza los productos y muestra cuántos fueron modificados y cuántos sin cambios.</w:t>
+      </w:r>
+    </w:p>
+    <w:p/>
+    <w:p>
+      <w:pPr>
+        <w:spacing w:before="40" w:after="40" w:line="276" w:lineRule="auto"/>
+      </w:pPr>
+      <w:r>
+        <w:rPr>
+          <w:sz w:val="20"/>
+        </w:rPr>
+        <w:t>Columnas que podés editar en la planilla:</w:t>
       </w:r>
     </w:p>
     <w:tbl>
@@ -5630,6 +5752,48 @@
           <w:tcPr>
             <w:tcW w:type="dxa" w:w="3324"/>
             <w:shd w:val="clear" w:color="auto" w:fill="4A3728"/>
+            <w:tcW w:w="1984" w:type="dxa"/>
+          </w:tcPr>
+          <w:p>
+            <w:pPr>
+              <w:spacing w:before="60" w:after="60"/>
+              <w:jc w:val="center"/>
+            </w:pPr>
+            <w:r>
+              <w:rPr>
+                <w:b/>
+                <w:color w:val="FFFFFF"/>
+                <w:sz w:val="19"/>
+              </w:rPr>
+              <w:t>Columna</w:t>
+            </w:r>
+          </w:p>
+        </w:tc>
+        <w:tc>
+          <w:tcPr>
+            <w:tcW w:type="dxa" w:w="3324"/>
+            <w:shd w:val="clear" w:color="auto" w:fill="4A3728"/>
+            <w:tcW w:w="4252" w:type="dxa"/>
+          </w:tcPr>
+          <w:p>
+            <w:pPr>
+              <w:spacing w:before="60" w:after="60"/>
+              <w:jc w:val="center"/>
+            </w:pPr>
+            <w:r>
+              <w:rPr>
+                <w:b/>
+                <w:color w:val="FFFFFF"/>
+                <w:sz w:val="19"/>
+              </w:rPr>
+              <w:t>Qué controla</w:t>
+            </w:r>
+          </w:p>
+        </w:tc>
+        <w:tc>
+          <w:tcPr>
+            <w:tcW w:type="dxa" w:w="3324"/>
+            <w:shd w:val="clear" w:color="auto" w:fill="4A3728"/>
             <w:tcW w:w="2268" w:type="dxa"/>
           </w:tcPr>
           <w:p>
@@ -5643,54 +5807,50 @@
                 <w:color w:val="FFFFFF"/>
                 <w:sz w:val="19"/>
               </w:rPr>
-              <w:t>Función</w:t>
+              <w:t>Editable</w:t>
+            </w:r>
+          </w:p>
+        </w:tc>
+      </w:tr>
+      <w:tr>
+        <w:tc>
+          <w:tcPr>
+            <w:tcW w:type="dxa" w:w="3324"/>
+            <w:shd w:val="clear" w:color="auto" w:fill="FAF7F2"/>
+            <w:tcW w:w="1984" w:type="dxa"/>
+          </w:tcPr>
+          <w:p>
+            <w:pPr>
+              <w:spacing w:before="60" w:after="60"/>
+            </w:pPr>
+            <w:r>
+              <w:rPr>
+                <w:b/>
+                <w:color w:val="4A3728"/>
+                <w:sz w:val="19"/>
+              </w:rPr>
+              <w:t>ID</w:t>
             </w:r>
           </w:p>
         </w:tc>
         <w:tc>
           <w:tcPr>
             <w:tcW w:type="dxa" w:w="3324"/>
-            <w:shd w:val="clear" w:color="auto" w:fill="4A3728"/>
-            <w:tcW w:w="3402" w:type="dxa"/>
+            <w:shd w:val="clear" w:color="auto" w:fill="FAF7F2"/>
+            <w:tcW w:w="4252" w:type="dxa"/>
           </w:tcPr>
           <w:p>
             <w:pPr>
               <w:spacing w:before="60" w:after="60"/>
-              <w:jc w:val="center"/>
             </w:pPr>
             <w:r>
               <w:rPr>
-                <w:b/>
-                <w:color w:val="FFFFFF"/>
                 <w:sz w:val="19"/>
               </w:rPr>
-              <w:t>Qué hace</w:t>
+              <w:t>Identificador único del producto</w:t>
             </w:r>
           </w:p>
         </w:tc>
-        <w:tc>
-          <w:tcPr>
-            <w:tcW w:type="dxa" w:w="3324"/>
-            <w:shd w:val="clear" w:color="auto" w:fill="4A3728"/>
-            <w:tcW w:w="3118" w:type="dxa"/>
-          </w:tcPr>
-          <w:p>
-            <w:pPr>
-              <w:spacing w:before="60" w:after="60"/>
-              <w:jc w:val="center"/>
-            </w:pPr>
-            <w:r>
-              <w:rPr>
-                <w:b/>
-                <w:color w:val="FFFFFF"/>
-                <w:sz w:val="19"/>
-              </w:rPr>
-              <w:t>Cuándo usarla</w:t>
-            </w:r>
-          </w:p>
-        </w:tc>
-      </w:tr>
-      <w:tr>
         <w:tc>
           <w:tcPr>
             <w:tcW w:type="dxa" w:w="3324"/>
@@ -5703,17 +5863,41 @@
             </w:pPr>
             <w:r>
               <w:rPr>
+                <w:b/>
+                <w:color w:val="DC2626"/>
                 <w:sz w:val="19"/>
               </w:rPr>
-              <w:t>Importar Kairosdis</w:t>
+              <w:t>NO — nunca modificar</w:t>
+            </w:r>
+          </w:p>
+        </w:tc>
+      </w:tr>
+      <w:tr>
+        <w:tc>
+          <w:tcPr>
+            <w:tcW w:type="dxa" w:w="3324"/>
+            <w:shd w:val="clear" w:color="auto" w:fill="FFFFFF"/>
+            <w:tcW w:w="1984" w:type="dxa"/>
+          </w:tcPr>
+          <w:p>
+            <w:pPr>
+              <w:spacing w:before="60" w:after="60"/>
+            </w:pPr>
+            <w:r>
+              <w:rPr>
+                <w:b/>
+                <w:color w:val="4A3728"/>
+                <w:sz w:val="19"/>
+              </w:rPr>
+              <w:t>Precio Minorista</w:t>
             </w:r>
           </w:p>
         </w:tc>
         <w:tc>
           <w:tcPr>
             <w:tcW w:type="dxa" w:w="3324"/>
-            <w:shd w:val="clear" w:color="auto" w:fill="FAF7F2"/>
-            <w:tcW w:w="3402" w:type="dxa"/>
+            <w:shd w:val="clear" w:color="auto" w:fill="FFFFFF"/>
+            <w:tcW w:w="4252" w:type="dxa"/>
           </w:tcPr>
           <w:p>
             <w:pPr>
@@ -5723,30 +5907,10 @@
               <w:rPr>
                 <w:sz w:val="19"/>
               </w:rPr>
-              <w:t>Descarga todos los productos de kairosdis.com.ar automáticamente</w:t>
+              <w:t>Precio de venta al público (ARS)</w:t>
             </w:r>
           </w:p>
         </w:tc>
-        <w:tc>
-          <w:tcPr>
-            <w:tcW w:type="dxa" w:w="3324"/>
-            <w:shd w:val="clear" w:color="auto" w:fill="FAF7F2"/>
-            <w:tcW w:w="3118" w:type="dxa"/>
-          </w:tcPr>
-          <w:p>
-            <w:pPr>
-              <w:spacing w:before="60" w:after="60"/>
-            </w:pPr>
-            <w:r>
-              <w:rPr>
-                <w:sz w:val="19"/>
-              </w:rPr>
-              <w:t>Cuando necesitás actualizar el catálogo completo desde el sitio fuente</w:t>
-            </w:r>
-          </w:p>
-        </w:tc>
-      </w:tr>
-      <w:tr>
         <w:tc>
           <w:tcPr>
             <w:tcW w:type="dxa" w:w="3324"/>
@@ -5759,17 +5923,41 @@
             </w:pPr>
             <w:r>
               <w:rPr>
+                <w:b/>
+                <w:color w:val="16A34A"/>
                 <w:sz w:val="19"/>
               </w:rPr>
-              <w:t>Sync desde Sheet</w:t>
+              <w:t>Sí</w:t>
+            </w:r>
+          </w:p>
+        </w:tc>
+      </w:tr>
+      <w:tr>
+        <w:tc>
+          <w:tcPr>
+            <w:tcW w:type="dxa" w:w="3324"/>
+            <w:shd w:val="clear" w:color="auto" w:fill="FAF7F2"/>
+            <w:tcW w:w="1984" w:type="dxa"/>
+          </w:tcPr>
+          <w:p>
+            <w:pPr>
+              <w:spacing w:before="60" w:after="60"/>
+            </w:pPr>
+            <w:r>
+              <w:rPr>
+                <w:b/>
+                <w:color w:val="4A3728"/>
+                <w:sz w:val="19"/>
+              </w:rPr>
+              <w:t>Precio Mayorista</w:t>
             </w:r>
           </w:p>
         </w:tc>
         <w:tc>
           <w:tcPr>
             <w:tcW w:type="dxa" w:w="3324"/>
-            <w:shd w:val="clear" w:color="auto" w:fill="FFFFFF"/>
-            <w:tcW w:w="3402" w:type="dxa"/>
+            <w:shd w:val="clear" w:color="auto" w:fill="FAF7F2"/>
+            <w:tcW w:w="4252" w:type="dxa"/>
           </w:tcPr>
           <w:p>
             <w:pPr>
@@ -5779,7 +5967,49 @@
               <w:rPr>
                 <w:sz w:val="19"/>
               </w:rPr>
-              <w:t>Lee precios desde una planilla Google Sheets y los aplica al catálogo</w:t>
+              <w:t>Precio de venta a revendedores (ARS)</w:t>
+            </w:r>
+          </w:p>
+        </w:tc>
+        <w:tc>
+          <w:tcPr>
+            <w:tcW w:type="dxa" w:w="3324"/>
+            <w:shd w:val="clear" w:color="auto" w:fill="FAF7F2"/>
+            <w:tcW w:w="2268" w:type="dxa"/>
+          </w:tcPr>
+          <w:p>
+            <w:pPr>
+              <w:spacing w:before="60" w:after="60"/>
+            </w:pPr>
+            <w:r>
+              <w:rPr>
+                <w:b/>
+                <w:color w:val="16A34A"/>
+                <w:sz w:val="19"/>
+              </w:rPr>
+              <w:t>Sí</w:t>
+            </w:r>
+          </w:p>
+        </w:tc>
+      </w:tr>
+      <w:tr>
+        <w:tc>
+          <w:tcPr>
+            <w:tcW w:type="dxa" w:w="3324"/>
+            <w:shd w:val="clear" w:color="auto" w:fill="FFFFFF"/>
+            <w:tcW w:w="1984" w:type="dxa"/>
+          </w:tcPr>
+          <w:p>
+            <w:pPr>
+              <w:spacing w:before="60" w:after="60"/>
+            </w:pPr>
+            <w:r>
+              <w:rPr>
+                <w:b/>
+                <w:color w:val="4A3728"/>
+                <w:sz w:val="19"/>
+              </w:rPr>
+              <w:t>Precio Promo</w:t>
             </w:r>
           </w:p>
         </w:tc>
@@ -5787,7 +6017,7 @@
           <w:tcPr>
             <w:tcW w:type="dxa" w:w="3324"/>
             <w:shd w:val="clear" w:color="auto" w:fill="FFFFFF"/>
-            <w:tcW w:w="3118" w:type="dxa"/>
+            <w:tcW w:w="4252" w:type="dxa"/>
           </w:tcPr>
           <w:p>
             <w:pPr>
@@ -5797,7 +6027,260 @@
               <w:rPr>
                 <w:sz w:val="19"/>
               </w:rPr>
-              <w:t>Para actualizar precios en masa sin entrar producto por producto</w:t>
+              <w:t>Precio promocional opcional (ARS)</w:t>
+            </w:r>
+          </w:p>
+        </w:tc>
+        <w:tc>
+          <w:tcPr>
+            <w:tcW w:type="dxa" w:w="3324"/>
+            <w:shd w:val="clear" w:color="auto" w:fill="FFFFFF"/>
+            <w:tcW w:w="2268" w:type="dxa"/>
+          </w:tcPr>
+          <w:p>
+            <w:pPr>
+              <w:spacing w:before="60" w:after="60"/>
+            </w:pPr>
+            <w:r>
+              <w:rPr>
+                <w:b/>
+                <w:color w:val="16A34A"/>
+                <w:sz w:val="19"/>
+              </w:rPr>
+              <w:t>Sí</w:t>
+            </w:r>
+          </w:p>
+        </w:tc>
+      </w:tr>
+      <w:tr>
+        <w:tc>
+          <w:tcPr>
+            <w:tcW w:type="dxa" w:w="3324"/>
+            <w:shd w:val="clear" w:color="auto" w:fill="FAF7F2"/>
+            <w:tcW w:w="1984" w:type="dxa"/>
+          </w:tcPr>
+          <w:p>
+            <w:pPr>
+              <w:spacing w:before="60" w:after="60"/>
+            </w:pPr>
+            <w:r>
+              <w:rPr>
+                <w:b/>
+                <w:color w:val="4A3728"/>
+                <w:sz w:val="19"/>
+              </w:rPr>
+              <w:t>Stock</w:t>
+            </w:r>
+          </w:p>
+        </w:tc>
+        <w:tc>
+          <w:tcPr>
+            <w:tcW w:type="dxa" w:w="3324"/>
+            <w:shd w:val="clear" w:color="auto" w:fill="FAF7F2"/>
+            <w:tcW w:w="4252" w:type="dxa"/>
+          </w:tcPr>
+          <w:p>
+            <w:pPr>
+              <w:spacing w:before="60" w:after="60"/>
+            </w:pPr>
+            <w:r>
+              <w:rPr>
+                <w:sz w:val="19"/>
+              </w:rPr>
+              <w:t>Unidades disponibles (número entero)</w:t>
+            </w:r>
+          </w:p>
+        </w:tc>
+        <w:tc>
+          <w:tcPr>
+            <w:tcW w:type="dxa" w:w="3324"/>
+            <w:shd w:val="clear" w:color="auto" w:fill="FAF7F2"/>
+            <w:tcW w:w="2268" w:type="dxa"/>
+          </w:tcPr>
+          <w:p>
+            <w:pPr>
+              <w:spacing w:before="60" w:after="60"/>
+            </w:pPr>
+            <w:r>
+              <w:rPr>
+                <w:b/>
+                <w:color w:val="16A34A"/>
+                <w:sz w:val="19"/>
+              </w:rPr>
+              <w:t>Sí</w:t>
+            </w:r>
+          </w:p>
+        </w:tc>
+      </w:tr>
+      <w:tr>
+        <w:tc>
+          <w:tcPr>
+            <w:tcW w:type="dxa" w:w="3324"/>
+            <w:shd w:val="clear" w:color="auto" w:fill="FFFFFF"/>
+            <w:tcW w:w="1984" w:type="dxa"/>
+          </w:tcPr>
+          <w:p>
+            <w:pPr>
+              <w:spacing w:before="60" w:after="60"/>
+            </w:pPr>
+            <w:r>
+              <w:rPr>
+                <w:b/>
+                <w:color w:val="4A3728"/>
+                <w:sz w:val="19"/>
+              </w:rPr>
+              <w:t>Activo</w:t>
+            </w:r>
+          </w:p>
+        </w:tc>
+        <w:tc>
+          <w:tcPr>
+            <w:tcW w:type="dxa" w:w="3324"/>
+            <w:shd w:val="clear" w:color="auto" w:fill="FFFFFF"/>
+            <w:tcW w:w="4252" w:type="dxa"/>
+          </w:tcPr>
+          <w:p>
+            <w:pPr>
+              <w:spacing w:before="60" w:after="60"/>
+            </w:pPr>
+            <w:r>
+              <w:rPr>
+                <w:sz w:val="19"/>
+              </w:rPr>
+              <w:t>Sí = visible en catálogo  /  No = oculto</w:t>
+            </w:r>
+          </w:p>
+        </w:tc>
+        <w:tc>
+          <w:tcPr>
+            <w:tcW w:type="dxa" w:w="3324"/>
+            <w:shd w:val="clear" w:color="auto" w:fill="FFFFFF"/>
+            <w:tcW w:w="2268" w:type="dxa"/>
+          </w:tcPr>
+          <w:p>
+            <w:pPr>
+              <w:spacing w:before="60" w:after="60"/>
+            </w:pPr>
+            <w:r>
+              <w:rPr>
+                <w:b/>
+                <w:color w:val="16A34A"/>
+                <w:sz w:val="19"/>
+              </w:rPr>
+              <w:t>Sí</w:t>
+            </w:r>
+          </w:p>
+        </w:tc>
+      </w:tr>
+      <w:tr>
+        <w:tc>
+          <w:tcPr>
+            <w:tcW w:type="dxa" w:w="3324"/>
+            <w:shd w:val="clear" w:color="auto" w:fill="FAF7F2"/>
+            <w:tcW w:w="1984" w:type="dxa"/>
+          </w:tcPr>
+          <w:p>
+            <w:pPr>
+              <w:spacing w:before="60" w:after="60"/>
+            </w:pPr>
+            <w:r>
+              <w:rPr>
+                <w:b w:val="0"/>
+                <w:color w:val="6B4F3A"/>
+                <w:sz w:val="19"/>
+              </w:rPr>
+              <w:t>Nombre</w:t>
+            </w:r>
+          </w:p>
+        </w:tc>
+        <w:tc>
+          <w:tcPr>
+            <w:tcW w:type="dxa" w:w="3324"/>
+            <w:shd w:val="clear" w:color="auto" w:fill="FAF7F2"/>
+            <w:tcW w:w="4252" w:type="dxa"/>
+          </w:tcPr>
+          <w:p>
+            <w:pPr>
+              <w:spacing w:before="60" w:after="60"/>
+            </w:pPr>
+            <w:r>
+              <w:rPr>
+                <w:sz w:val="19"/>
+              </w:rPr>
+              <w:t>Solo referencia visual — no se sincroniza</w:t>
+            </w:r>
+          </w:p>
+        </w:tc>
+        <w:tc>
+          <w:tcPr>
+            <w:tcW w:type="dxa" w:w="3324"/>
+            <w:shd w:val="clear" w:color="auto" w:fill="FAF7F2"/>
+            <w:tcW w:w="2268" w:type="dxa"/>
+          </w:tcPr>
+          <w:p>
+            <w:pPr>
+              <w:spacing w:before="60" w:after="60"/>
+            </w:pPr>
+            <w:r>
+              <w:rPr>
+                <w:b w:val="0"/>
+                <w:color w:val="94A3B8"/>
+                <w:sz w:val="19"/>
+              </w:rPr>
+              <w:t>No aplica</w:t>
+            </w:r>
+          </w:p>
+        </w:tc>
+      </w:tr>
+    </w:tbl>
+    <w:p/>
+    <w:tbl>
+      <w:tblPr>
+        <w:tblW w:type="auto" w:w="0"/>
+        <w:tblLook w:firstColumn="1" w:firstRow="1" w:lastColumn="0" w:lastRow="0" w:noHBand="0" w:noVBand="1" w:val="04A0"/>
+        <w:tblBorders>
+          <w:top w:val="none"/>
+          <w:left w:val="none"/>
+          <w:bottom w:val="none"/>
+          <w:right w:val="none"/>
+          <w:insideH w:val="none"/>
+          <w:insideV w:val="none"/>
+        </w:tblBorders>
+      </w:tblPr>
+      <w:tblGrid>
+        <w:gridCol w:w="4986"/>
+        <w:gridCol w:w="4986"/>
+      </w:tblGrid>
+      <w:tr>
+        <w:tc>
+          <w:tcPr>
+            <w:tcW w:type="dxa" w:w="4986"/>
+            <w:shd w:val="clear" w:color="auto" w:fill="D97706"/>
+            <w:tcW w:w="160" w:type="dxa"/>
+          </w:tcPr>
+          <w:p>
+            <w:r>
+              <w:t xml:space="preserve"> </w:t>
+            </w:r>
+          </w:p>
+        </w:tc>
+        <w:tc>
+          <w:tcPr>
+            <w:tcW w:type="dxa" w:w="4986"/>
+            <w:shd w:val="clear" w:color="auto" w:fill="FFFFBA"/>
+          </w:tcPr>
+          <w:p>
+            <w:pPr>
+              <w:spacing w:before="100" w:after="100"/>
+              <w:ind w:left="142"/>
+            </w:pPr>
+            <w:r>
+              <w:rPr>
+                <w:i/>
+                <w:color w:val="4A3728"/>
+                <w:sz w:val="19"/>
+              </w:rPr>
+              <w:t>Lo que NO se actualiza por Sheet: nombre, descripcion, imagen y categoria. Para cambiar esos campos hay que editar el producto manualmente desde el Catalogo.</w:t>
             </w:r>
           </w:p>
         </w:tc>

</xml_diff>